<commit_message>
fix: remove blank page from complete report
</commit_message>
<xml_diff>
--- a/reports/给彭老师的完整实验报告_2026-08-02至2026-08-04.docx
+++ b/reports/给彭老师的完整实验报告_2026-08-02至2026-08-04.docx
@@ -370,11 +370,6 @@
       </w:tr>
     </w:tbl>
     <w:p/>
-    <w:p>
-      <w:r>
-        <w:br w:type="page"/>
-      </w:r>
-    </w:p>
     <w:p>
       <w:pPr>
         <w:pStyle w:val="Heading1"/>

</xml_diff>